<commit_message>
2026.10.19/김나은/문서 React+Django API 기준으로 정리, Cognito→자체 회원·세션 로그인, django-htmx 제거
</commit_message>
<xml_diff>
--- a/산출물/01_기획/4팀_프로젝트_기획서.docx
+++ b/산출물/01_기획/4팀_프로젝트_기획서.docx
@@ -2250,7 +2250,7 @@
                 <w:szCs w:val="18"/>
                 <w:rtl w:val="0"/>
               </w:rPr>
-              <w:t xml:space="preserve">Django 템플릿 + HTMX 기반 모바일 웹 / 네이티브 앱은 후속 개발</w:t>
+              <w:t xml:space="preserve">React 화면 + Django API 기반 모바일 웹 / 네이티브 앱은 후속 개발</w:t>
             </w:r>
           </w:p>
         </w:tc>
@@ -9697,7 +9697,7 @@
                 <w:szCs w:val="18"/>
                 <w:rtl w:val="0"/>
               </w:rPr>
-              <w:t xml:space="preserve">Django 템플릿 · HTMX</w:t>
+              <w:t xml:space="preserve">React · Vite (Django API와 JSON 통신)</w:t>
             </w:r>
           </w:p>
         </w:tc>
@@ -9804,7 +9804,7 @@
                 <w:szCs w:val="18"/>
                 <w:rtl w:val="0"/>
               </w:rPr>
-              <w:t xml:space="preserve">Python · Django, Amazon Cognito (JWT)</w:t>
+              <w:t xml:space="preserve">Python · Django · Django REST framework, 자체 회원 · 세션 로그인</w:t>
             </w:r>
           </w:p>
         </w:tc>
@@ -10267,7 +10267,7 @@
                 <w:szCs w:val="18"/>
                 <w:rtl w:val="0"/>
               </w:rPr>
-              <w:t xml:space="preserve">Reverse Proxy · Django · AI Worker 3개 컨테이너</w:t>
+              <w:t xml:space="preserve">Reverse Proxy(React 빌드 파일) · Django · AI Worker 3개 컨테이너</w:t>
             </w:r>
           </w:p>
         </w:tc>
@@ -10422,7 +10422,7 @@
           <w:szCs w:val="17"/>
           <w:rtl w:val="0"/>
         </w:rPr>
-        <w:t xml:space="preserve">※ 1차 제공 형태는 Django 템플릿과 HTMX로 만든 모바일 웹이다. 화면과 서버를 Django 하나로 구현한다. 네이티브 앱은 후속 개발 단계로 분리하며 화면·기기 기능 대응 작업이 별도로 필요하다. 나머지 기술은 팀 숙련도와 최소 구현 검증 결과로 확정한다.</w:t>
+        <w:t xml:space="preserve">※ 1차 제공 형태는 React로 만든 모바일 웹이다. 화면은 React, 데이터 · 계산 · 인증은 Django API(DRF)가 맡는다. 네이티브 앱은 후속 개발 단계로 분리하며 화면·기기 기능 대응 작업이 별도로 필요하다. 나머지 기술은 팀 숙련도와 최소 구현 검증 결과로 확정한다.</w:t>
       </w:r>
     </w:p>
     <w:p>
@@ -20118,7 +20118,7 @@
                 <w:szCs w:val="18"/>
                 <w:rtl w:val="0"/>
               </w:rPr>
-              <w:t xml:space="preserve">전처리 · DB 설계 완료, 분류 · 비율 기준선, Django 화면 초기 설정 · 온보딩 · 추천 예산 화면, 라우터 · 통합 챗봇 골격, 회원 · CODEF 연결 화면</w:t>
+              <w:t xml:space="preserve">전처리 · DB 설계 완료, 분류 · 비율 기준선, React 화면 · Django API 초기 설정 · 온보딩 · 추천 예산 화면, 라우터 · 통합 챗봇 골격, 회원 · CODEF 연결 화면</w:t>
             </w:r>
           </w:p>
         </w:tc>

</xml_diff>